<commit_message>
updated thesis doc and roadmap
</commit_message>
<xml_diff>
--- a/docs/proposal/Rahul_Thesis_Proposal.docx
+++ b/docs/proposal/Rahul_Thesis_Proposal.docx
@@ -324,7 +324,7 @@
           <w:lang w:val="en-IN"/>
         </w:rPr>
         <w:tab/>
-        <w:t>1.2</w:t>
+        <w:t>1.3</w:t>
       </w:r>
     </w:p>
     <w:p>
@@ -356,7 +356,7 @@
           <w:lang w:val="en-IN"/>
         </w:rPr>
         <w:tab/>
-        <w:t>September 5, 2026</w:t>
+        <w:t>September 11, 2026</w:t>
       </w:r>
     </w:p>
     <w:p>
@@ -667,7 +667,7 @@
         <w:rPr>
           <w:lang w:val="en-IN"/>
         </w:rPr>
-        <w:t>The study will begin with a controlled collection of 50 digital paintings. The collection will be balanced across five broad visual categories: portrait and figure, landscape and natural scenes, architecture and structured scenes, abstraction and surrealism, and high-texture or brushwork-heavy paintings. These categories support reproducible grouping within the study; they are not independently validated art-historical styles or a claim to represent the full diversity of painting traditions. After the controlled stage validates the pipeline, the target remains an expansion to approximately 300 to 1,000 paintings, subject to compute, rights information, image quality and metadata coverage.</w:t>
+        <w:t>The study will use 300 digital paintings, balanced across five broad visual categories with 60 paintings in each: portrait and figure, landscape and natural scenes, architecture and structured scenes, abstraction and surrealism, and high-texture or brushwork-heavy paintings. These categories support reproducible grouping; they are not independently validated art-historical styles and do not represent the full diversity of painting traditions. The fixed benchmark retains the documented requirements for rights information, image quality and metadata coverage.</w:t>
       </w:r>
     </w:p>
     <w:p>
@@ -689,7 +689,7 @@
         <w:rPr>
           <w:lang w:val="en-IN"/>
         </w:rPr>
-        <w:t>The controlled collection will use public-domain or open-access records from The Metropolitan Museum of Art, the Art Institute of Chicago and the Rijksmuseum. Source records will preserve institution, object identifier, source URL, image URL, access date, rights category and the rights statement supplied by the institution. These fields record provenance and stated reuse conditions; they are not a blanket legal conclusion about every downstream use. WikiArt and ArtBench will not be used as image sources. ArtBench may remain in related work as an example of artwork benchmarking (Liao et al., 2022).</w:t>
+        <w:t>The controlled collection will use public-domain or open-access records from multiple museum and cultural-heritage collections. The largest source groups are the Cleveland Museum of Art, The Metropolitan Museum of Art, Statens Museum for Kunst, the National Gallery of Art, the Art Institute of Chicago and the Rijksmuseum, with smaller contributions from other institutions and documented open-access records. Source records will preserve institution, object identifier, source URL, image URL, access date, rights category and the rights statement supplied by the institution. These fields record provenance and stated reuse conditions; they are not a blanket legal conclusion about every downstream use. WikiArt and ArtBench will not be used as image sources. ArtBench may remain in related work as an example of artwork benchmarking (Liao et al., 2022).</w:t>
       </w:r>
     </w:p>
     <w:p>
@@ -743,6 +743,7 @@
             </w:pPr>
             <w:r>
               <w:rPr>
+                <w:rFonts w:ascii="Arial" w:hAnsi="Arial" w:eastAsia="Arial" w:cs="Arial"/>
                 <w:b/>
                 <w:sz w:val="18"/>
               </w:rPr>
@@ -769,6 +770,7 @@
             </w:pPr>
             <w:r>
               <w:rPr>
+                <w:rFonts w:ascii="Arial" w:hAnsi="Arial" w:eastAsia="Arial" w:cs="Arial"/>
                 <w:b/>
                 <w:sz w:val="18"/>
               </w:rPr>
@@ -800,6 +802,7 @@
             </w:pPr>
             <w:r>
               <w:rPr>
+                <w:rFonts w:ascii="Arial" w:hAnsi="Arial" w:eastAsia="Arial" w:cs="Arial"/>
                 <w:sz w:val="18"/>
               </w:rPr>
               <w:t>Clean images</w:t>
@@ -827,6 +830,7 @@
             </w:pPr>
             <w:r>
               <w:rPr>
+                <w:rFonts w:ascii="Arial" w:hAnsi="Arial" w:eastAsia="Arial" w:cs="Arial"/>
                 <w:sz w:val="18"/>
                 <w:lang w:val="en-IN"/>
               </w:rPr>
@@ -858,6 +862,7 @@
             </w:pPr>
             <w:r>
               <w:rPr>
+                <w:rFonts w:ascii="Arial" w:hAnsi="Arial" w:eastAsia="Arial" w:cs="Arial"/>
                 <w:sz w:val="18"/>
               </w:rPr>
               <w:t>Metadata</w:t>
@@ -885,6 +890,7 @@
             </w:pPr>
             <w:r>
               <w:rPr>
+                <w:rFonts w:ascii="Arial" w:hAnsi="Arial" w:eastAsia="Arial" w:cs="Arial"/>
                 <w:sz w:val="18"/>
                 <w:lang w:val="en-IN"/>
               </w:rPr>
@@ -916,6 +922,7 @@
             </w:pPr>
             <w:r>
               <w:rPr>
+                <w:rFonts w:ascii="Arial" w:hAnsi="Arial" w:eastAsia="Arial" w:cs="Arial"/>
                 <w:sz w:val="18"/>
               </w:rPr>
               <w:t>Masks and degradation definitions</w:t>
@@ -943,6 +950,7 @@
             </w:pPr>
             <w:r>
               <w:rPr>
+                <w:rFonts w:ascii="Arial" w:hAnsi="Arial" w:eastAsia="Arial" w:cs="Arial"/>
                 <w:sz w:val="18"/>
                 <w:lang w:val="en-IN"/>
               </w:rPr>
@@ -974,6 +982,7 @@
             </w:pPr>
             <w:r>
               <w:rPr>
+                <w:rFonts w:ascii="Arial" w:hAnsi="Arial" w:eastAsia="Arial" w:cs="Arial"/>
                 <w:sz w:val="18"/>
               </w:rPr>
               <w:t>Damaged images</w:t>
@@ -1001,6 +1010,7 @@
             </w:pPr>
             <w:r>
               <w:rPr>
+                <w:rFonts w:ascii="Arial" w:hAnsi="Arial" w:eastAsia="Arial" w:cs="Arial"/>
                 <w:sz w:val="18"/>
                 <w:lang w:val="en-IN"/>
               </w:rPr>
@@ -1032,6 +1042,7 @@
             </w:pPr>
             <w:r>
               <w:rPr>
+                <w:rFonts w:ascii="Arial" w:hAnsi="Arial" w:eastAsia="Arial" w:cs="Arial"/>
                 <w:sz w:val="18"/>
               </w:rPr>
               <w:t>Restoration candidates</w:t>
@@ -1059,6 +1070,7 @@
             </w:pPr>
             <w:r>
               <w:rPr>
+                <w:rFonts w:ascii="Arial" w:hAnsi="Arial" w:eastAsia="Arial" w:cs="Arial"/>
                 <w:sz w:val="18"/>
                 <w:lang w:val="en-IN"/>
               </w:rPr>
@@ -1090,6 +1102,7 @@
             </w:pPr>
             <w:r>
               <w:rPr>
+                <w:rFonts w:ascii="Arial" w:hAnsi="Arial" w:eastAsia="Arial" w:cs="Arial"/>
                 <w:sz w:val="18"/>
               </w:rPr>
               <w:t>Metric tables and maps</w:t>
@@ -1117,6 +1130,7 @@
             </w:pPr>
             <w:r>
               <w:rPr>
+                <w:rFonts w:ascii="Arial" w:hAnsi="Arial" w:eastAsia="Arial" w:cs="Arial"/>
                 <w:sz w:val="18"/>
                 <w:lang w:val="en-IN"/>
               </w:rPr>
@@ -1148,6 +1162,7 @@
             </w:pPr>
             <w:r>
               <w:rPr>
+                <w:rFonts w:ascii="Arial" w:hAnsi="Arial" w:eastAsia="Arial" w:cs="Arial"/>
                 <w:sz w:val="18"/>
               </w:rPr>
               <w:t>Manifests and validation records</w:t>
@@ -1175,6 +1190,7 @@
             </w:pPr>
             <w:r>
               <w:rPr>
+                <w:rFonts w:ascii="Arial" w:hAnsi="Arial" w:eastAsia="Arial" w:cs="Arial"/>
                 <w:sz w:val="18"/>
                 <w:lang w:val="en-IN"/>
               </w:rPr>
@@ -1340,6 +1356,7 @@
             </w:pPr>
             <w:r>
               <w:rPr>
+                <w:rFonts w:ascii="Arial" w:hAnsi="Arial" w:eastAsia="Arial" w:cs="Arial"/>
                 <w:b/>
                 <w:sz w:val="19"/>
               </w:rPr>
@@ -1365,6 +1382,7 @@
             </w:pPr>
             <w:r>
               <w:rPr>
+                <w:rFonts w:ascii="Arial" w:hAnsi="Arial" w:eastAsia="Arial" w:cs="Arial"/>
                 <w:b/>
                 <w:sz w:val="19"/>
               </w:rPr>
@@ -1396,6 +1414,7 @@
             </w:pPr>
             <w:r>
               <w:rPr>
+                <w:rFonts w:ascii="Arial" w:hAnsi="Arial" w:eastAsia="Arial" w:cs="Arial"/>
                 <w:sz w:val="19"/>
               </w:rPr>
               <w:t>Canonical damage</w:t>
@@ -1423,6 +1442,7 @@
             </w:pPr>
             <w:r>
               <w:rPr>
+                <w:rFonts w:ascii="Arial" w:hAnsi="Arial" w:eastAsia="Arial" w:cs="Arial"/>
                 <w:sz w:val="19"/>
                 <w:lang w:val="en-IN"/>
               </w:rPr>
@@ -1454,6 +1474,7 @@
             </w:pPr>
             <w:r>
               <w:rPr>
+                <w:rFonts w:ascii="Arial" w:hAnsi="Arial" w:eastAsia="Arial" w:cs="Arial"/>
                 <w:sz w:val="19"/>
               </w:rPr>
               <w:t>Damage-size sensitivity</w:t>
@@ -1481,6 +1502,7 @@
             </w:pPr>
             <w:r>
               <w:rPr>
+                <w:rFonts w:ascii="Arial" w:hAnsi="Arial" w:eastAsia="Arial" w:cs="Arial"/>
                 <w:sz w:val="19"/>
                 <w:lang w:val="en-IN"/>
               </w:rPr>
@@ -1512,6 +1534,7 @@
             </w:pPr>
             <w:r>
               <w:rPr>
+                <w:rFonts w:ascii="Arial" w:hAnsi="Arial" w:eastAsia="Arial" w:cs="Arial"/>
                 <w:sz w:val="19"/>
               </w:rPr>
               <w:t>Mask robustness</w:t>
@@ -1539,6 +1562,7 @@
             </w:pPr>
             <w:r>
               <w:rPr>
+                <w:rFonts w:ascii="Arial" w:hAnsi="Arial" w:eastAsia="Arial" w:cs="Arial"/>
                 <w:sz w:val="19"/>
                 <w:lang w:val="en-IN"/>
               </w:rPr>
@@ -1570,6 +1594,7 @@
             </w:pPr>
             <w:r>
               <w:rPr>
+                <w:rFonts w:ascii="Arial" w:hAnsi="Arial" w:eastAsia="Arial" w:cs="Arial"/>
                 <w:sz w:val="19"/>
               </w:rPr>
               <w:t>Procedural synthetic degradation</w:t>
@@ -1597,6 +1622,7 @@
             </w:pPr>
             <w:r>
               <w:rPr>
+                <w:rFonts w:ascii="Arial" w:hAnsi="Arial" w:eastAsia="Arial" w:cs="Arial"/>
                 <w:sz w:val="19"/>
                 <w:lang w:val="en-IN"/>
               </w:rPr>
@@ -1880,7 +1906,7 @@
         </w:rPr>
       </w:pPr>
       <w:r>
-        <w:t>The planned full method comparison will include OpenCV Telea as a classical deterministic baseline, LaMa as a pretrained deterministic Fourier-convolution baseline, HINT as a deterministic mask-aware transformer baseline, and Stable Diffusion 1.5 Inpainting as a stochastic, prompt-conditioned baseline (Telea, 2004; Suvorov et al., 2022; Chen et al., 2024; Rombach et al., 2022). HINT adds a second learned deterministic architecture with mask-aware encoding and multi-scale, long-range context modelling, rather than duplicating the role of LaMa or diffusion. SDXL Inpainting will be evaluated separately in a bounded feasibility branch and will not be presented as a full benchmark (Podell et al., 2024). A further heritage-specific method may be considered only if suitable code, weights, licensing and compute are available.</w:t>
+        <w:t>The planned full method comparison will include OpenCV Telea as a classical deterministic baseline, LaMa as a pretrained deterministic Fourier-convolution baseline, HINT as a deterministic mask-aware transformer baseline, and Stable Diffusion 1.5 Inpainting as a stochastic, prompt-conditioned baseline (Telea, 2004; Suvorov et al., 2022; Chen et al., 2024; Rombach et al., 2022). HINT adds a second learned deterministic architecture with mask-aware encoding and multi-scale, long-range context modelling, rather than duplicating the role of LaMa or diffusion. SDXL Inpainting will be evaluated separately in a bounded feasibility branch and will not be presented as a full benchmark (Podell et al., 2024).</w:t>
       </w:r>
     </w:p>
     <w:p>
@@ -1922,7 +1948,7 @@
         <w:rPr>
           <w:lang w:val="en-IN"/>
         </w:rPr>
-        <w:t>The thin-scratch prompt analysis will compare generic and damage-aware prompts across the controlled 50-painting collection and the approved seeds for each prompt arm. Additional damage-size candidates will support group-level variability. Unless the complete reference-quality suite is computed for those additional candidates, their repeated-candidate evidence will remain separate from individual full-quality claims.</w:t>
+        <w:t>The thin-scratch prompt analysis will compare generic and damage-aware prompts for eligible thin-scratch cases across the controlled 300-painting collection and the approved seeds for each prompt arm. Additional damage-size candidates will support group-level variability. Unless the complete reference-quality suite is computed for those additional candidates, their repeated-candidate evidence will remain separate from individual full-quality claims.</w:t>
       </w:r>
     </w:p>
     <w:p>
@@ -2307,6 +2333,7 @@
             </w:pPr>
             <w:r>
               <w:rPr>
+                <w:rFonts w:ascii="Arial" w:hAnsi="Arial" w:eastAsia="Arial" w:cs="Arial"/>
                 <w:b/>
                 <w:sz w:val="17"/>
               </w:rPr>
@@ -2332,6 +2359,7 @@
             </w:pPr>
             <w:r>
               <w:rPr>
+                <w:rFonts w:ascii="Arial" w:hAnsi="Arial" w:eastAsia="Arial" w:cs="Arial"/>
                 <w:b/>
                 <w:sz w:val="17"/>
               </w:rPr>
@@ -2357,6 +2385,7 @@
             </w:pPr>
             <w:r>
               <w:rPr>
+                <w:rFonts w:ascii="Arial" w:hAnsi="Arial" w:eastAsia="Arial" w:cs="Arial"/>
                 <w:b/>
                 <w:sz w:val="17"/>
               </w:rPr>
@@ -2392,6 +2421,7 @@
             </w:pPr>
             <w:r>
               <w:rPr>
+                <w:rFonts w:ascii="Arial" w:hAnsi="Arial" w:eastAsia="Arial" w:cs="Arial"/>
                 <w:sz w:val="17"/>
                 <w:lang w:val="en-IN"/>
               </w:rPr>
@@ -2420,6 +2450,7 @@
             </w:pPr>
             <w:r>
               <w:rPr>
+                <w:rFonts w:ascii="Arial" w:hAnsi="Arial" w:eastAsia="Arial" w:cs="Arial"/>
                 <w:sz w:val="17"/>
                 <w:lang w:val="en-IN"/>
               </w:rPr>
@@ -2448,6 +2479,7 @@
             </w:pPr>
             <w:r>
               <w:rPr>
+                <w:rFonts w:ascii="Arial" w:hAnsi="Arial" w:eastAsia="Arial" w:cs="Arial"/>
                 <w:sz w:val="17"/>
                 <w:lang w:val="en-IN"/>
               </w:rPr>
@@ -2483,6 +2515,7 @@
             </w:pPr>
             <w:r>
               <w:rPr>
+                <w:rFonts w:ascii="Arial" w:hAnsi="Arial" w:eastAsia="Arial" w:cs="Arial"/>
                 <w:sz w:val="17"/>
                 <w:lang w:val="en-IN"/>
               </w:rPr>
@@ -2510,6 +2543,10 @@
               </w:rPr>
             </w:pPr>
             <w:r>
+              <w:rPr>
+                <w:rFonts w:ascii="Arial" w:hAnsi="Arial" w:eastAsia="Arial" w:cs="Arial"/>
+                <w:sz w:val="17"/>
+              </w:rPr>
               <w:t>Paired comparison of Telea, LaMa, HINT and Stable Diffusion; bounded SDXL feasibility; grouped analysis across eligible cases.</w:t>
             </w:r>
           </w:p>
@@ -2534,6 +2571,10 @@
               </w:rPr>
             </w:pPr>
             <w:r>
+              <w:rPr>
+                <w:rFonts w:ascii="Arial" w:hAnsi="Arial" w:eastAsia="Arial" w:cs="Arial"/>
+                <w:sz w:val="17"/>
+              </w:rPr>
               <w:t>Four-method comparisons with painting-level effect sizes, intervals, consistency evidence and explicit scope boundaries.</w:t>
             </w:r>
           </w:p>
@@ -2566,6 +2607,7 @@
             </w:pPr>
             <w:r>
               <w:rPr>
+                <w:rFonts w:ascii="Arial" w:hAnsi="Arial" w:eastAsia="Arial" w:cs="Arial"/>
                 <w:sz w:val="17"/>
                 <w:lang w:val="en-IN"/>
               </w:rPr>
@@ -2594,6 +2636,7 @@
             </w:pPr>
             <w:r>
               <w:rPr>
+                <w:rFonts w:ascii="Arial" w:hAnsi="Arial" w:eastAsia="Arial" w:cs="Arial"/>
                 <w:sz w:val="17"/>
                 <w:lang w:val="en-IN"/>
               </w:rPr>
@@ -2622,6 +2665,7 @@
             </w:pPr>
             <w:r>
               <w:rPr>
+                <w:rFonts w:ascii="Arial" w:hAnsi="Arial" w:eastAsia="Arial" w:cs="Arial"/>
                 <w:sz w:val="17"/>
                 <w:lang w:val="en-IN"/>
               </w:rPr>
@@ -2654,6 +2698,7 @@
             </w:pPr>
             <w:r>
               <w:rPr>
+                <w:rFonts w:ascii="Arial" w:hAnsi="Arial" w:eastAsia="Arial" w:cs="Arial"/>
                 <w:sz w:val="17"/>
               </w:rPr>
               <w:t>Practical deliverable</w:t>
@@ -2681,6 +2726,7 @@
             </w:pPr>
             <w:r>
               <w:rPr>
+                <w:rFonts w:ascii="Arial" w:hAnsi="Arial" w:eastAsia="Arial" w:cs="Arial"/>
                 <w:sz w:val="17"/>
                 <w:lang w:val="en-IN"/>
               </w:rPr>
@@ -2709,6 +2755,7 @@
             </w:pPr>
             <w:r>
               <w:rPr>
+                <w:rFonts w:ascii="Arial" w:hAnsi="Arial" w:eastAsia="Arial" w:cs="Arial"/>
                 <w:sz w:val="17"/>
                 <w:lang w:val="en-IN"/>
               </w:rPr>
@@ -2878,7 +2925,7 @@
             </w:pPr>
             <w:r>
               <w:rPr>
-                <w:rFonts w:cs="Arial"/>
+                <w:rFonts w:cs="Arial" w:ascii="Arial" w:hAnsi="Arial" w:eastAsia="Arial"/>
                 <w:b/>
                 <w:color w:val="000000"/>
                 <w:sz w:val="17"/>
@@ -2911,7 +2958,7 @@
             </w:pPr>
             <w:r>
               <w:rPr>
-                <w:rFonts w:cs="Arial"/>
+                <w:rFonts w:cs="Arial" w:ascii="Arial" w:hAnsi="Arial" w:eastAsia="Arial"/>
                 <w:b/>
                 <w:color w:val="000000"/>
                 <w:sz w:val="17"/>
@@ -2945,7 +2992,7 @@
             </w:pPr>
             <w:r>
               <w:rPr>
-                <w:rFonts w:cs="Arial"/>
+                <w:rFonts w:cs="Arial" w:ascii="Arial" w:hAnsi="Arial" w:eastAsia="Arial"/>
                 <w:b/>
                 <w:color w:val="000000"/>
                 <w:sz w:val="17"/>
@@ -2979,7 +3026,7 @@
             </w:pPr>
             <w:r>
               <w:rPr>
-                <w:rFonts w:cs="Arial"/>
+                <w:rFonts w:cs="Arial" w:ascii="Arial" w:hAnsi="Arial" w:eastAsia="Arial"/>
                 <w:b/>
                 <w:color w:val="000000"/>
                 <w:sz w:val="17"/>
@@ -3013,7 +3060,7 @@
             </w:pPr>
             <w:r>
               <w:rPr>
-                <w:rFonts w:cs="Arial"/>
+                <w:rFonts w:cs="Arial" w:ascii="Arial" w:hAnsi="Arial" w:eastAsia="Arial"/>
                 <w:b/>
                 <w:color w:val="000000"/>
                 <w:sz w:val="17"/>
@@ -3053,7 +3100,7 @@
             </w:pPr>
             <w:r>
               <w:rPr>
-                <w:rFonts w:cs="Arial"/>
+                <w:rFonts w:cs="Arial" w:ascii="Arial" w:hAnsi="Arial" w:eastAsia="Arial"/>
                 <w:sz w:val="17"/>
                 <w:lang w:val="en-US"/>
               </w:rPr>
@@ -3083,7 +3130,7 @@
             </w:pPr>
             <w:r>
               <w:rPr>
-                <w:rFonts w:cs="Arial"/>
+                <w:rFonts w:cs="Arial" w:ascii="Arial" w:hAnsi="Arial" w:eastAsia="Arial"/>
                 <w:sz w:val="17"/>
                 <w:lang w:val="en-US"/>
               </w:rPr>
@@ -3114,7 +3161,7 @@
             </w:pPr>
             <w:r>
               <w:rPr>
-                <w:rFonts w:cs="Arial"/>
+                <w:rFonts w:cs="Arial" w:ascii="Arial" w:hAnsi="Arial" w:eastAsia="Arial"/>
                 <w:sz w:val="17"/>
                 <w:lang w:val="en-US"/>
               </w:rPr>
@@ -3122,7 +3169,7 @@
             </w:r>
             <w:r>
               <w:rPr>
-                <w:rFonts w:cs="Arial"/>
+                <w:rFonts w:cs="Arial" w:ascii="Arial" w:hAnsi="Arial" w:eastAsia="Arial"/>
                 <w:sz w:val="17"/>
                 <w:lang w:val="en-US"/>
               </w:rPr>
@@ -3206,7 +3253,7 @@
             </w:pPr>
             <w:r>
               <w:rPr>
-                <w:rFonts w:cs="Arial"/>
+                <w:rFonts w:cs="Arial" w:ascii="Arial" w:hAnsi="Arial" w:eastAsia="Arial"/>
                 <w:sz w:val="17"/>
                 <w:lang w:val="en-US"/>
               </w:rPr>
@@ -3236,7 +3283,7 @@
             </w:pPr>
             <w:r>
               <w:rPr>
-                <w:rFonts w:cs="Arial"/>
+                <w:rFonts w:cs="Arial" w:ascii="Arial" w:hAnsi="Arial" w:eastAsia="Arial"/>
                 <w:sz w:val="17"/>
                 <w:lang w:val="en-US"/>
               </w:rPr>
@@ -3267,7 +3314,7 @@
             </w:pPr>
             <w:r>
               <w:rPr>
-                <w:rFonts w:cs="Arial"/>
+                <w:rFonts w:cs="Arial" w:ascii="Arial" w:hAnsi="Arial" w:eastAsia="Arial"/>
                 <w:sz w:val="17"/>
                 <w:lang w:val="en-US"/>
               </w:rPr>
@@ -3351,7 +3398,7 @@
             </w:pPr>
             <w:r>
               <w:rPr>
-                <w:rFonts w:cs="Arial"/>
+                <w:rFonts w:cs="Arial" w:ascii="Arial" w:hAnsi="Arial" w:eastAsia="Arial"/>
                 <w:sz w:val="17"/>
                 <w:lang w:val="en-US"/>
               </w:rPr>
@@ -3381,7 +3428,7 @@
             </w:pPr>
             <w:r>
               <w:rPr>
-                <w:rFonts w:cs="Arial"/>
+                <w:rFonts w:cs="Arial" w:ascii="Arial" w:hAnsi="Arial" w:eastAsia="Arial"/>
                 <w:sz w:val="17"/>
                 <w:lang w:val="en-IN"/>
               </w:rPr>
@@ -3412,7 +3459,7 @@
             </w:pPr>
             <w:r>
               <w:rPr>
-                <w:rFonts w:cs="Arial"/>
+                <w:rFonts w:cs="Arial" w:ascii="Arial" w:hAnsi="Arial" w:eastAsia="Arial"/>
                 <w:sz w:val="17"/>
                 <w:lang w:val="en-US"/>
               </w:rPr>
@@ -3496,7 +3543,7 @@
             </w:pPr>
             <w:r>
               <w:rPr>
-                <w:rFonts w:cs="Arial"/>
+                <w:rFonts w:cs="Arial" w:ascii="Arial" w:hAnsi="Arial" w:eastAsia="Arial"/>
                 <w:sz w:val="17"/>
                 <w:lang w:val="en-US"/>
               </w:rPr>
@@ -3526,7 +3573,7 @@
             </w:pPr>
             <w:r>
               <w:rPr>
-                <w:rFonts w:cs="Arial"/>
+                <w:rFonts w:cs="Arial" w:ascii="Arial" w:hAnsi="Arial" w:eastAsia="Arial"/>
                 <w:sz w:val="17"/>
                 <w:lang w:val="en-IN"/>
               </w:rPr>
@@ -3557,7 +3604,7 @@
             </w:pPr>
             <w:r>
               <w:rPr>
-                <w:rFonts w:cs="Arial"/>
+                <w:rFonts w:cs="Arial" w:ascii="Arial" w:hAnsi="Arial" w:eastAsia="Arial"/>
                 <w:sz w:val="17"/>
                 <w:lang w:val="en-US"/>
               </w:rPr>
@@ -3641,7 +3688,7 @@
             </w:pPr>
             <w:r>
               <w:rPr>
-                <w:rFonts w:cs="Arial"/>
+                <w:rFonts w:cs="Arial" w:ascii="Arial" w:hAnsi="Arial" w:eastAsia="Arial"/>
                 <w:sz w:val="17"/>
                 <w:lang w:val="en-US"/>
               </w:rPr>
@@ -3671,7 +3718,7 @@
             </w:pPr>
             <w:r>
               <w:rPr>
-                <w:rFonts w:cs="Arial"/>
+                <w:rFonts w:cs="Arial" w:ascii="Arial" w:hAnsi="Arial" w:eastAsia="Arial"/>
                 <w:sz w:val="17"/>
                 <w:lang w:val="en-IN"/>
               </w:rPr>
@@ -3702,7 +3749,7 @@
             </w:pPr>
             <w:r>
               <w:rPr>
-                <w:rFonts w:cs="Arial"/>
+                <w:rFonts w:cs="Arial" w:ascii="Arial" w:hAnsi="Arial" w:eastAsia="Arial"/>
                 <w:sz w:val="17"/>
                 <w:lang w:val="en-US"/>
               </w:rPr>
@@ -3786,7 +3833,7 @@
             </w:pPr>
             <w:r>
               <w:rPr>
-                <w:rFonts w:cs="Arial"/>
+                <w:rFonts w:cs="Arial" w:ascii="Arial" w:hAnsi="Arial" w:eastAsia="Arial"/>
                 <w:sz w:val="17"/>
                 <w:lang w:val="en-US"/>
               </w:rPr>
@@ -3816,7 +3863,7 @@
             </w:pPr>
             <w:r>
               <w:rPr>
-                <w:rFonts w:cs="Arial"/>
+                <w:rFonts w:cs="Arial" w:ascii="Arial" w:hAnsi="Arial" w:eastAsia="Arial"/>
                 <w:sz w:val="17"/>
                 <w:lang w:val="en-IN"/>
               </w:rPr>
@@ -3847,7 +3894,7 @@
             </w:pPr>
             <w:r>
               <w:rPr>
-                <w:rFonts w:cs="Arial"/>
+                <w:rFonts w:cs="Arial" w:ascii="Arial" w:hAnsi="Arial" w:eastAsia="Arial"/>
                 <w:sz w:val="17"/>
                 <w:lang w:val="en-US"/>
               </w:rPr>
@@ -3931,7 +3978,7 @@
             </w:pPr>
             <w:r>
               <w:rPr>
-                <w:rFonts w:cs="Arial"/>
+                <w:rFonts w:cs="Arial" w:ascii="Arial" w:hAnsi="Arial" w:eastAsia="Arial"/>
                 <w:sz w:val="17"/>
                 <w:lang w:val="en-US"/>
               </w:rPr>
@@ -3961,7 +4008,7 @@
             </w:pPr>
             <w:r>
               <w:rPr>
-                <w:rFonts w:cs="Arial"/>
+                <w:rFonts w:cs="Arial" w:ascii="Arial" w:hAnsi="Arial" w:eastAsia="Arial"/>
                 <w:sz w:val="17"/>
                 <w:lang w:val="en-IN"/>
               </w:rPr>
@@ -3992,7 +4039,7 @@
             </w:pPr>
             <w:r>
               <w:rPr>
-                <w:rFonts w:cs="Arial"/>
+                <w:rFonts w:cs="Arial" w:ascii="Arial" w:hAnsi="Arial" w:eastAsia="Arial"/>
                 <w:sz w:val="17"/>
                 <w:lang w:val="en-US"/>
               </w:rPr>
@@ -4076,7 +4123,7 @@
             </w:pPr>
             <w:r>
               <w:rPr>
-                <w:rFonts w:cs="Arial"/>
+                <w:rFonts w:cs="Arial" w:ascii="Arial" w:hAnsi="Arial" w:eastAsia="Arial"/>
                 <w:sz w:val="17"/>
                 <w:lang w:val="en-US"/>
               </w:rPr>
@@ -4106,7 +4153,7 @@
             </w:pPr>
             <w:r>
               <w:rPr>
-                <w:rFonts w:cs="Arial"/>
+                <w:rFonts w:cs="Arial" w:ascii="Arial" w:hAnsi="Arial" w:eastAsia="Arial"/>
                 <w:sz w:val="17"/>
                 <w:lang w:val="en-IN"/>
               </w:rPr>
@@ -4137,7 +4184,7 @@
             </w:pPr>
             <w:r>
               <w:rPr>
-                <w:rFonts w:cs="Arial"/>
+                <w:rFonts w:cs="Arial" w:ascii="Arial" w:hAnsi="Arial" w:eastAsia="Arial"/>
                 <w:sz w:val="17"/>
                 <w:lang w:val="en-US"/>
               </w:rPr>
@@ -4221,7 +4268,7 @@
             </w:pPr>
             <w:r>
               <w:rPr>
-                <w:rFonts w:cs="Arial"/>
+                <w:rFonts w:cs="Arial" w:ascii="Arial" w:hAnsi="Arial" w:eastAsia="Arial"/>
                 <w:sz w:val="17"/>
                 <w:lang w:val="en-US"/>
               </w:rPr>
@@ -4251,7 +4298,7 @@
             </w:pPr>
             <w:r>
               <w:rPr>
-                <w:rFonts w:cs="Arial"/>
+                <w:rFonts w:cs="Arial" w:ascii="Arial" w:hAnsi="Arial" w:eastAsia="Arial"/>
                 <w:sz w:val="17"/>
               </w:rPr>
               <w:t xml:space="preserve">Main </w:t>
@@ -4259,7 +4306,7 @@
             <w:proofErr w:type="spellStart"/>
             <w:r>
               <w:rPr>
-                <w:rFonts w:cs="Arial"/>
+                <w:rFonts w:cs="Arial" w:ascii="Arial" w:hAnsi="Arial" w:eastAsia="Arial"/>
                 <w:sz w:val="17"/>
               </w:rPr>
               <w:t>restoration</w:t>
@@ -4267,7 +4314,7 @@
             <w:proofErr w:type="spellEnd"/>
             <w:r>
               <w:rPr>
-                <w:rFonts w:cs="Arial"/>
+                <w:rFonts w:cs="Arial" w:ascii="Arial" w:hAnsi="Arial" w:eastAsia="Arial"/>
                 <w:sz w:val="17"/>
               </w:rPr>
               <w:t xml:space="preserve"> </w:t>
@@ -4275,7 +4322,7 @@
             <w:proofErr w:type="spellStart"/>
             <w:r>
               <w:rPr>
-                <w:rFonts w:cs="Arial"/>
+                <w:rFonts w:cs="Arial" w:ascii="Arial" w:hAnsi="Arial" w:eastAsia="Arial"/>
                 <w:sz w:val="17"/>
               </w:rPr>
               <w:t>experiments</w:t>
@@ -4283,7 +4330,7 @@
             <w:proofErr w:type="spellEnd"/>
             <w:r>
               <w:rPr>
-                <w:rFonts w:cs="Arial"/>
+                <w:rFonts w:cs="Arial" w:ascii="Arial" w:hAnsi="Arial" w:eastAsia="Arial"/>
                 <w:sz w:val="17"/>
               </w:rPr>
               <w:t xml:space="preserve"> </w:t>
@@ -4291,7 +4338,7 @@
             <w:proofErr w:type="spellStart"/>
             <w:r>
               <w:rPr>
-                <w:rFonts w:cs="Arial"/>
+                <w:rFonts w:cs="Arial" w:ascii="Arial" w:hAnsi="Arial" w:eastAsia="Arial"/>
                 <w:sz w:val="17"/>
               </w:rPr>
               <w:t>completed</w:t>
@@ -4322,7 +4369,7 @@
             </w:pPr>
             <w:r>
               <w:rPr>
-                <w:rFonts w:cs="Arial"/>
+                <w:rFonts w:cs="Arial" w:ascii="Arial" w:hAnsi="Arial" w:eastAsia="Arial"/>
                 <w:sz w:val="17"/>
                 <w:lang w:val="en-US"/>
               </w:rPr>
@@ -4406,7 +4453,7 @@
             </w:pPr>
             <w:r>
               <w:rPr>
-                <w:rFonts w:cs="Arial"/>
+                <w:rFonts w:cs="Arial" w:ascii="Arial" w:hAnsi="Arial" w:eastAsia="Arial"/>
                 <w:sz w:val="17"/>
                 <w:lang w:val="en-US"/>
               </w:rPr>
@@ -4435,6 +4482,7 @@
             </w:pPr>
             <w:r>
               <w:rPr>
+                <w:rFonts w:ascii="Arial" w:hAnsi="Arial" w:eastAsia="Arial" w:cs="Arial"/>
                 <w:sz w:val="17"/>
                 <w:lang w:val="en-IN"/>
               </w:rPr>
@@ -4465,7 +4513,7 @@
             </w:pPr>
             <w:r>
               <w:rPr>
-                <w:rFonts w:cs="Arial"/>
+                <w:rFonts w:cs="Arial" w:ascii="Arial" w:hAnsi="Arial" w:eastAsia="Arial"/>
                 <w:sz w:val="17"/>
                 <w:lang w:val="en-US"/>
               </w:rPr>
@@ -4549,7 +4597,7 @@
             </w:pPr>
             <w:r>
               <w:rPr>
-                <w:rFonts w:cs="Arial"/>
+                <w:rFonts w:cs="Arial" w:ascii="Arial" w:hAnsi="Arial" w:eastAsia="Arial"/>
                 <w:sz w:val="17"/>
                 <w:lang w:val="en-US"/>
               </w:rPr>
@@ -4579,7 +4627,7 @@
             </w:pPr>
             <w:r>
               <w:rPr>
-                <w:rFonts w:cs="Arial"/>
+                <w:rFonts w:cs="Arial" w:ascii="Arial" w:hAnsi="Arial" w:eastAsia="Arial"/>
                 <w:sz w:val="17"/>
                 <w:lang w:val="en-IN"/>
               </w:rPr>
@@ -4610,7 +4658,7 @@
             </w:pPr>
             <w:r>
               <w:rPr>
-                <w:rFonts w:cs="Arial"/>
+                <w:rFonts w:cs="Arial" w:ascii="Arial" w:hAnsi="Arial" w:eastAsia="Arial"/>
                 <w:sz w:val="17"/>
                 <w:lang w:val="en-US"/>
               </w:rPr>
@@ -4694,7 +4742,7 @@
             </w:pPr>
             <w:r>
               <w:rPr>
-                <w:rFonts w:cs="Arial"/>
+                <w:rFonts w:cs="Arial" w:ascii="Arial" w:hAnsi="Arial" w:eastAsia="Arial"/>
                 <w:sz w:val="17"/>
                 <w:lang w:val="en-US"/>
               </w:rPr>
@@ -4724,7 +4772,7 @@
             </w:pPr>
             <w:r>
               <w:rPr>
-                <w:rFonts w:cs="Arial"/>
+                <w:rFonts w:cs="Arial" w:ascii="Arial" w:hAnsi="Arial" w:eastAsia="Arial"/>
                 <w:sz w:val="17"/>
                 <w:lang w:val="en-IN"/>
               </w:rPr>
@@ -4755,7 +4803,7 @@
             </w:pPr>
             <w:r>
               <w:rPr>
-                <w:rFonts w:cs="Arial"/>
+                <w:rFonts w:cs="Arial" w:ascii="Arial" w:hAnsi="Arial" w:eastAsia="Arial"/>
                 <w:sz w:val="17"/>
                 <w:lang w:val="en-US"/>
               </w:rPr>
@@ -4839,7 +4887,7 @@
             </w:pPr>
             <w:r>
               <w:rPr>
-                <w:rFonts w:cs="Arial"/>
+                <w:rFonts w:cs="Arial" w:ascii="Arial" w:hAnsi="Arial" w:eastAsia="Arial"/>
                 <w:sz w:val="17"/>
                 <w:lang w:val="en-US"/>
               </w:rPr>
@@ -4869,7 +4917,7 @@
             </w:pPr>
             <w:r>
               <w:rPr>
-                <w:rFonts w:cs="Arial"/>
+                <w:rFonts w:cs="Arial" w:ascii="Arial" w:hAnsi="Arial" w:eastAsia="Arial"/>
                 <w:sz w:val="17"/>
               </w:rPr>
               <w:t xml:space="preserve">Final </w:t>
@@ -4877,7 +4925,7 @@
             <w:proofErr w:type="spellStart"/>
             <w:r>
               <w:rPr>
-                <w:rFonts w:cs="Arial"/>
+                <w:rFonts w:cs="Arial" w:ascii="Arial" w:hAnsi="Arial" w:eastAsia="Arial"/>
                 <w:sz w:val="17"/>
               </w:rPr>
               <w:t>version</w:t>
@@ -4885,7 +4933,7 @@
             <w:proofErr w:type="spellEnd"/>
             <w:r>
               <w:rPr>
-                <w:rFonts w:cs="Arial"/>
+                <w:rFonts w:cs="Arial" w:ascii="Arial" w:hAnsi="Arial" w:eastAsia="Arial"/>
                 <w:sz w:val="17"/>
               </w:rPr>
               <w:t xml:space="preserve"> </w:t>
@@ -4893,7 +4941,7 @@
             <w:proofErr w:type="spellStart"/>
             <w:r>
               <w:rPr>
-                <w:rFonts w:cs="Arial"/>
+                <w:rFonts w:cs="Arial" w:ascii="Arial" w:hAnsi="Arial" w:eastAsia="Arial"/>
                 <w:sz w:val="17"/>
               </w:rPr>
               <w:t>handed</w:t>
@@ -4901,7 +4949,7 @@
             <w:proofErr w:type="spellEnd"/>
             <w:r>
               <w:rPr>
-                <w:rFonts w:cs="Arial"/>
+                <w:rFonts w:cs="Arial" w:ascii="Arial" w:hAnsi="Arial" w:eastAsia="Arial"/>
                 <w:sz w:val="17"/>
               </w:rPr>
               <w:t xml:space="preserve"> in</w:t>
@@ -4931,7 +4979,7 @@
             </w:pPr>
             <w:r>
               <w:rPr>
-                <w:rFonts w:cs="Arial"/>
+                <w:rFonts w:cs="Arial" w:ascii="Arial" w:hAnsi="Arial" w:eastAsia="Arial"/>
                 <w:sz w:val="17"/>
                 <w:lang w:val="en-US"/>
               </w:rPr>
@@ -5015,7 +5063,7 @@
             </w:pPr>
             <w:r>
               <w:rPr>
-                <w:rFonts w:cs="Arial"/>
+                <w:rFonts w:cs="Arial" w:ascii="Arial" w:hAnsi="Arial" w:eastAsia="Arial"/>
                 <w:sz w:val="17"/>
                 <w:lang w:val="en-US"/>
               </w:rPr>
@@ -5045,7 +5093,7 @@
             </w:pPr>
             <w:r>
               <w:rPr>
-                <w:rFonts w:cs="Arial"/>
+                <w:rFonts w:cs="Arial" w:ascii="Arial" w:hAnsi="Arial" w:eastAsia="Arial"/>
                 <w:sz w:val="17"/>
                 <w:lang w:val="en-IN"/>
               </w:rPr>
@@ -5076,7 +5124,7 @@
             </w:pPr>
             <w:r>
               <w:rPr>
-                <w:rFonts w:cs="Arial"/>
+                <w:rFonts w:cs="Arial" w:ascii="Arial" w:hAnsi="Arial" w:eastAsia="Arial"/>
                 <w:sz w:val="17"/>
                 <w:lang w:val="en-US"/>
               </w:rPr>

</xml_diff>